<commit_message>
Add corrected report, presentation, and extended evaluation outputs
</commit_message>
<xml_diff>
--- a/reports/Assignment16_Final_Report.docx
+++ b/reports/Assignment16_Final_Report.docx
@@ -4,10 +4,14 @@
   <w:body>
     <w:p>
       <w:pPr>
-        <w:pStyle w:val="Title"/>
         <w:jc w:val="center"/>
       </w:pPr>
       <w:r>
+        <w:rPr>
+          <w:b/>
+          <w:color w:val="1F4E79"/>
+          <w:sz w:val="48"/>
+        </w:rPr>
         <w:t>Robustness of AI-Text Detection</w:t>
         <w:br/>
         <w:t>Under Text Editing and Paraphrasing</w:t>
@@ -18,12 +22,23 @@
         <w:jc w:val="center"/>
       </w:pPr>
       <w:r>
-        <w:rPr>
-          <w:b/>
-        </w:rPr>
-        <w:t>AI26501 • Modern AI Assignments • Assignment 16 • Group 16</w:t>
-        <w:br/>
-        <w:t>11 October 2026</w:t>
+        <w:t>AI26501 Modern AI Assignments • SP-2026 • Assignment 16 • Group 16</w:t>
+      </w:r>
+    </w:p>
+    <w:p>
+      <w:pPr>
+        <w:jc w:val="center"/>
+      </w:pPr>
+      <w:r>
+        <w:t>Corrected evaluation report • 12 October 2026</w:t>
+      </w:r>
+    </w:p>
+    <w:p>
+      <w:pPr>
+        <w:jc w:val="center"/>
+      </w:pPr>
+      <w:r>
+        <w:t>Presenter/team names: complete before submission</w:t>
       </w:r>
     </w:p>
     <w:p>
@@ -36,7 +51,7 @@
     </w:p>
     <w:p>
       <w:r>
-        <w:t>This study evaluates how wording changes affect a TF–IDF + LinearSVC classifier trained to distinguish human-written from AI-generated text in the Hello-SimpleAI/HC3 dataset. We compare original AI passages, light surface edits, and outputs from a T5-based paraphraser. The main paired evaluation covers 300 held-out question topics, with one human passage and one AI passage per condition. AI recall remained 98.00% after the tested surface edits but fell to 79.67% for semantic-paraphraser outputs. The result suggests sensitivity to the tested rewriting process, while the limited sample and paraphrase-quality issues restrict generalization.</w:t>
+        <w:t>This study evaluates a TF–IDF word-unigram/bigram representation with a LinearSVC detector trained on original passages from the HC3 Human–ChatGPT Comparison Corpus. The 300-topic held-out paired evaluation compares original AI text, a legacy phrase-removal edit that changed no sampled passages, a verified deterministic light-edit condition, model-generated T5 paraphrases, and a truncation control matched to paraphrase length. AI recall was 98.00% for original text, 97.00% after the verified light edits, 79.67% for T5 paraphrases, and 89.33% for truncation. The paraphrases had a mean length ratio of 0.561 relative to their originals, and the truncation control also reduced recall. Thus, the raw paraphrase result reflects both rewriting and substantial compression; it cannot be interpreted as the isolated causal effect of meaning-preserving paraphrase.</w:t>
       </w:r>
     </w:p>
     <w:p>
@@ -44,22 +59,12 @@
         <w:pStyle w:val="Heading1"/>
       </w:pPr>
       <w:r>
-        <w:t>1. Problem and research question</w:t>
+        <w:t>1. Problem statement and research question</w:t>
       </w:r>
     </w:p>
     <w:p>
       <w:r>
-        <w:t>AI-generated text can be edited before publication. A detector that performs well on original model outputs may not retain the same performance after rewriting. False positives can wrongly label human writing, while false negatives can allow AI-generated passages to be classified as human. The research question is: how much does detection performance change after surface editing or semantic paraphrasing of AI text?</w:t>
-      </w:r>
-    </w:p>
-    <w:p>
-      <w:r>
-        <w:t>H1: Small surface edits may have limited impact on detection performance.</w:t>
-      </w:r>
-    </w:p>
-    <w:p>
-      <w:r>
-        <w:t>H2: Semantic paraphrasing may reduce AI recall more than surface editing.</w:t>
+        <w:t>AI-generated passages may be edited or rewritten before publication. A detector can perform well on untouched text but be sensitive to wording, length, or other dataset-specific patterns. The research question is: how does a classical detector’s AI recall change under controlled lexical edits, generated paraphrases, and a length-matched truncation control? Primary outcome: AI recall. Secondary outcomes: accuracy, AI precision, AI F1, false-positive rate, confusion-matrix counts, and paired prediction changes.</w:t>
       </w:r>
     </w:p>
     <w:p>
@@ -67,17 +72,12 @@
         <w:pStyle w:val="Heading1"/>
       </w:pPr>
       <w:r>
-        <w:t>2. Dataset and preparation</w:t>
+        <w:t>2. Dataset and split</w:t>
       </w:r>
     </w:p>
     <w:p>
       <w:r>
-        <w:t>The study uses the Human–ChatGPT Comparison Corpus (HC3), with passages from Finance, Medicine, Open QA, Reddit ELI5, and Wiki CSAI. The prepared dataset is filtered to matched questions containing human and AI answers and deduplicated. The main grouped split uses GroupShuffleSplit with test_size=0.20 and random_state=42, grouping by topic_id. The reported split contains 17,528 training questions and 4,383 held-out questions, with no question-ID overlap between train and test.</w:t>
-      </w:r>
-    </w:p>
-    <w:p>
-      <w:r>
-        <w:t>The paired robustness evaluation uses 300 held-out topics. Each condition contains 300 human controls and 300 AI passages, for 600 passages per condition. The sample is source-imbalanced, with Reddit ELI5 accounting for 222 of the 300 paired topics.</w:t>
+        <w:t>The study uses a prepared English subset of Hello-SimpleAI/HC3, with finance, medicine, open_qa, reddit_eli5, and wiki_csai sources. The grouped split uses GroupShuffleSplit(test_size=0.20, random_state=42) grouped by topic_id. The saved split has 60,955 training passages, 15,157 test passages, 17,528 training topics, 4,383 held-out topics, and zero topic overlap. The paired pilot contains 300 held-out topics, each with one human control and one AI passage per condition. Source composition is imbalanced: Reddit ELI5 contributes 222 passages, Finance 38, Open QA 22, Medicine 15, and Wiki CSAI 3.</w:t>
       </w:r>
     </w:p>
     <w:p>
@@ -85,17 +85,57 @@
         <w:pStyle w:val="Heading1"/>
       </w:pPr>
       <w:r>
-        <w:t>3. Methodology</w:t>
+        <w:t>3. Methods and controls</w:t>
       </w:r>
     </w:p>
     <w:p>
       <w:r>
-        <w:t>The detector uses word-level TF–IDF unigrams and bigrams with a LinearSVC classifier and class_weight='balanced'. It is trained on original training passages only. The same held-out human controls are reused in the original, surface-edited, and semantic-paraphrase conditions. Metrics are computed on the combined human-plus-AI set for each condition.</w:t>
+        <w:t>The detector uses TF–IDF word unigrams and bigrams (min_df=2, max_features=200,000, sublinear_tf=True, strip_accents='unicode') and LinearSVC(class_weight='balanced', random_state=42). It is trained only on original training text. For each condition, the same 300 human controls are combined with 300 AI passages, giving 600 passages per condition.</w:t>
+      </w:r>
+    </w:p>
+    <w:p>
+      <w:pPr>
+        <w:pStyle w:val="ListBullet"/>
+      </w:pPr>
+      <w:r>
+        <w:t>Original AI: original AI passage for each selected topic.</w:t>
+      </w:r>
+    </w:p>
+    <w:p>
+      <w:pPr>
+        <w:pStyle w:val="ListBullet"/>
+      </w:pPr>
+      <w:r>
+        <w:t>Legacy surface edit: the existing opening-phrase-removal function. It changed 0/300 passages in this sample and is retained as a no-op diagnostic, not evidence of edit robustness.</w:t>
+      </w:r>
+    </w:p>
+    <w:p>
+      <w:pPr>
+        <w:pStyle w:val="ListBullet"/>
+      </w:pPr>
+      <w:r>
+        <w:t>Verified light edit: a deterministic rule-based lexical edit designed to change text where listed patterns occur. It changed 104/300 paired AI passages; mean length ratio was 0.999 relative to original text.</w:t>
+      </w:r>
+    </w:p>
+    <w:p>
+      <w:pPr>
+        <w:pStyle w:val="ListBullet"/>
+      </w:pPr>
+      <w:r>
+        <w:t>T5 paraphrase: generated by humarin/chatgpt_paraphraser_on_T5_base. These are raw model outputs and are not guaranteed to preserve meaning.</w:t>
+      </w:r>
+    </w:p>
+    <w:p>
+      <w:pPr>
+        <w:pStyle w:val="ListBullet"/>
+      </w:pPr>
+      <w:r>
+        <w:t>Truncation control: the original passage is truncated to the paraphrase's whitespace-word count when the original is longer. It changed 299/300 passages. For topic 11934, the original had 31 words and the paraphrase 33, so the original was left unchanged. This is a compression control, not a semantic-preservation control; truncation may remove claims or context.</w:t>
       </w:r>
     </w:p>
     <w:p>
       <w:r>
-        <w:t>Surface edits are lightweight textual changes. Semantic paraphrases are generated using humarin/chatgpt_paraphraser_on_T5_base. The final evaluation checks that the paraphrase topics belong to the held-out split to reduce leakage risk. The semantic-paraphrase evaluation is a 300-pair pilot and should not be directly compared with the larger, class-specific surface-edit robustness experiment.</w:t>
+        <w:t>Uncertainty: recall confidence intervals are 95% Wilson intervals. Paired changes in binary AI detections are assessed with exact McNemar tests. These tests compare paired predictions and do not address paraphrase fidelity or all sources of selection bias.</w:t>
       </w:r>
     </w:p>
     <w:p>
@@ -103,7 +143,7 @@
         <w:pStyle w:val="Heading1"/>
       </w:pPr>
       <w:r>
-        <w:t>4. Main paired results</w:t>
+        <w:t>4. Results</w:t>
       </w:r>
     </w:p>
     <w:tbl>
@@ -111,6 +151,560 @@
         <w:tblStyle w:val="LightShading-Accent1"/>
         <w:tblW w:type="auto" w:w="0"/>
         <w:jc w:val="center"/>
+        <w:tblLook w:firstColumn="1" w:firstRow="1" w:lastColumn="0" w:lastRow="0" w:noHBand="0" w:noVBand="1" w:val="04A0"/>
+      </w:tblPr>
+      <w:tblGrid>
+        <w:gridCol w:w="1419"/>
+        <w:gridCol w:w="1419"/>
+        <w:gridCol w:w="1419"/>
+        <w:gridCol w:w="1419"/>
+        <w:gridCol w:w="1419"/>
+        <w:gridCol w:w="1419"/>
+        <w:gridCol w:w="1419"/>
+      </w:tblGrid>
+      <w:tr>
+        <w:tc>
+          <w:tcPr>
+            <w:tcW w:type="dxa" w:w="1419"/>
+          </w:tcPr>
+          <w:p>
+            <w:r>
+              <w:rPr>
+                <w:b/>
+              </w:rPr>
+              <w:t>Condition</w:t>
+            </w:r>
+          </w:p>
+        </w:tc>
+        <w:tc>
+          <w:tcPr>
+            <w:tcW w:type="dxa" w:w="1419"/>
+          </w:tcPr>
+          <w:p>
+            <w:r>
+              <w:rPr>
+                <w:b/>
+              </w:rPr>
+              <w:t>Accuracy</w:t>
+            </w:r>
+          </w:p>
+        </w:tc>
+        <w:tc>
+          <w:tcPr>
+            <w:tcW w:type="dxa" w:w="1419"/>
+          </w:tcPr>
+          <w:p>
+            <w:r>
+              <w:rPr>
+                <w:b/>
+              </w:rPr>
+              <w:t>AI precision</w:t>
+            </w:r>
+          </w:p>
+        </w:tc>
+        <w:tc>
+          <w:tcPr>
+            <w:tcW w:type="dxa" w:w="1419"/>
+          </w:tcPr>
+          <w:p>
+            <w:r>
+              <w:rPr>
+                <w:b/>
+              </w:rPr>
+              <w:t>AI recall (95% CI)</w:t>
+            </w:r>
+          </w:p>
+        </w:tc>
+        <w:tc>
+          <w:tcPr>
+            <w:tcW w:type="dxa" w:w="1419"/>
+          </w:tcPr>
+          <w:p>
+            <w:r>
+              <w:rPr>
+                <w:b/>
+              </w:rPr>
+              <w:t>AI F1</w:t>
+            </w:r>
+          </w:p>
+        </w:tc>
+        <w:tc>
+          <w:tcPr>
+            <w:tcW w:type="dxa" w:w="1419"/>
+          </w:tcPr>
+          <w:p>
+            <w:r>
+              <w:rPr>
+                <w:b/>
+              </w:rPr>
+              <w:t>FPR</w:t>
+            </w:r>
+          </w:p>
+        </w:tc>
+        <w:tc>
+          <w:tcPr>
+            <w:tcW w:type="dxa" w:w="1419"/>
+          </w:tcPr>
+          <w:p>
+            <w:r>
+              <w:rPr>
+                <w:b/>
+              </w:rPr>
+              <w:t>FN / TP</w:t>
+            </w:r>
+          </w:p>
+        </w:tc>
+      </w:tr>
+      <w:tr>
+        <w:tc>
+          <w:tcPr>
+            <w:tcW w:type="dxa" w:w="1419"/>
+          </w:tcPr>
+          <w:p>
+            <w:r>
+              <w:t>Original AI</w:t>
+            </w:r>
+          </w:p>
+        </w:tc>
+        <w:tc>
+          <w:tcPr>
+            <w:tcW w:type="dxa" w:w="1419"/>
+          </w:tcPr>
+          <w:p>
+            <w:r>
+              <w:t>98.83%</w:t>
+            </w:r>
+          </w:p>
+        </w:tc>
+        <w:tc>
+          <w:tcPr>
+            <w:tcW w:type="dxa" w:w="1419"/>
+          </w:tcPr>
+          <w:p>
+            <w:r>
+              <w:t>99.66%</w:t>
+            </w:r>
+          </w:p>
+        </w:tc>
+        <w:tc>
+          <w:tcPr>
+            <w:tcW w:type="dxa" w:w="1419"/>
+          </w:tcPr>
+          <w:p>
+            <w:r>
+              <w:t>98.00% (95.71–99.08)</w:t>
+            </w:r>
+          </w:p>
+        </w:tc>
+        <w:tc>
+          <w:tcPr>
+            <w:tcW w:type="dxa" w:w="1419"/>
+          </w:tcPr>
+          <w:p>
+            <w:r>
+              <w:t>98.82%</w:t>
+            </w:r>
+          </w:p>
+        </w:tc>
+        <w:tc>
+          <w:tcPr>
+            <w:tcW w:type="dxa" w:w="1419"/>
+          </w:tcPr>
+          <w:p>
+            <w:r>
+              <w:t>0.33%</w:t>
+            </w:r>
+          </w:p>
+        </w:tc>
+        <w:tc>
+          <w:tcPr>
+            <w:tcW w:type="dxa" w:w="1419"/>
+          </w:tcPr>
+          <w:p>
+            <w:r>
+              <w:t>6 / 294</w:t>
+            </w:r>
+          </w:p>
+        </w:tc>
+      </w:tr>
+      <w:tr>
+        <w:tc>
+          <w:tcPr>
+            <w:tcW w:type="dxa" w:w="1419"/>
+          </w:tcPr>
+          <w:p>
+            <w:r>
+              <w:t>Legacy phrase-removal</w:t>
+            </w:r>
+          </w:p>
+        </w:tc>
+        <w:tc>
+          <w:tcPr>
+            <w:tcW w:type="dxa" w:w="1419"/>
+          </w:tcPr>
+          <w:p>
+            <w:r>
+              <w:t>98.83%</w:t>
+            </w:r>
+          </w:p>
+        </w:tc>
+        <w:tc>
+          <w:tcPr>
+            <w:tcW w:type="dxa" w:w="1419"/>
+          </w:tcPr>
+          <w:p>
+            <w:r>
+              <w:t>99.66%</w:t>
+            </w:r>
+          </w:p>
+        </w:tc>
+        <w:tc>
+          <w:tcPr>
+            <w:tcW w:type="dxa" w:w="1419"/>
+          </w:tcPr>
+          <w:p>
+            <w:r>
+              <w:t>98.00% (95.71–99.08)</w:t>
+            </w:r>
+          </w:p>
+        </w:tc>
+        <w:tc>
+          <w:tcPr>
+            <w:tcW w:type="dxa" w:w="1419"/>
+          </w:tcPr>
+          <w:p>
+            <w:r>
+              <w:t>98.82%</w:t>
+            </w:r>
+          </w:p>
+        </w:tc>
+        <w:tc>
+          <w:tcPr>
+            <w:tcW w:type="dxa" w:w="1419"/>
+          </w:tcPr>
+          <w:p>
+            <w:r>
+              <w:t>0.33%</w:t>
+            </w:r>
+          </w:p>
+        </w:tc>
+        <w:tc>
+          <w:tcPr>
+            <w:tcW w:type="dxa" w:w="1419"/>
+          </w:tcPr>
+          <w:p>
+            <w:r>
+              <w:t>6 / 294</w:t>
+            </w:r>
+          </w:p>
+        </w:tc>
+      </w:tr>
+      <w:tr>
+        <w:tc>
+          <w:tcPr>
+            <w:tcW w:type="dxa" w:w="1419"/>
+          </w:tcPr>
+          <w:p>
+            <w:r>
+              <w:t>Verified light edit</w:t>
+            </w:r>
+          </w:p>
+        </w:tc>
+        <w:tc>
+          <w:tcPr>
+            <w:tcW w:type="dxa" w:w="1419"/>
+          </w:tcPr>
+          <w:p>
+            <w:r>
+              <w:t>98.33%</w:t>
+            </w:r>
+          </w:p>
+        </w:tc>
+        <w:tc>
+          <w:tcPr>
+            <w:tcW w:type="dxa" w:w="1419"/>
+          </w:tcPr>
+          <w:p>
+            <w:r>
+              <w:t>99.66%</w:t>
+            </w:r>
+          </w:p>
+        </w:tc>
+        <w:tc>
+          <w:tcPr>
+            <w:tcW w:type="dxa" w:w="1419"/>
+          </w:tcPr>
+          <w:p>
+            <w:r>
+              <w:t>97.00% (94.40–98.41)</w:t>
+            </w:r>
+          </w:p>
+        </w:tc>
+        <w:tc>
+          <w:tcPr>
+            <w:tcW w:type="dxa" w:w="1419"/>
+          </w:tcPr>
+          <w:p>
+            <w:r>
+              <w:t>98.31%</w:t>
+            </w:r>
+          </w:p>
+        </w:tc>
+        <w:tc>
+          <w:tcPr>
+            <w:tcW w:type="dxa" w:w="1419"/>
+          </w:tcPr>
+          <w:p>
+            <w:r>
+              <w:t>0.33%</w:t>
+            </w:r>
+          </w:p>
+        </w:tc>
+        <w:tc>
+          <w:tcPr>
+            <w:tcW w:type="dxa" w:w="1419"/>
+          </w:tcPr>
+          <w:p>
+            <w:r>
+              <w:t>9 / 291</w:t>
+            </w:r>
+          </w:p>
+        </w:tc>
+      </w:tr>
+      <w:tr>
+        <w:tc>
+          <w:tcPr>
+            <w:tcW w:type="dxa" w:w="1419"/>
+          </w:tcPr>
+          <w:p>
+            <w:r>
+              <w:t>T5 paraphrase</w:t>
+            </w:r>
+          </w:p>
+        </w:tc>
+        <w:tc>
+          <w:tcPr>
+            <w:tcW w:type="dxa" w:w="1419"/>
+          </w:tcPr>
+          <w:p>
+            <w:r>
+              <w:t>89.67%</w:t>
+            </w:r>
+          </w:p>
+        </w:tc>
+        <w:tc>
+          <w:tcPr>
+            <w:tcW w:type="dxa" w:w="1419"/>
+          </w:tcPr>
+          <w:p>
+            <w:r>
+              <w:t>99.58%</w:t>
+            </w:r>
+          </w:p>
+        </w:tc>
+        <w:tc>
+          <w:tcPr>
+            <w:tcW w:type="dxa" w:w="1419"/>
+          </w:tcPr>
+          <w:p>
+            <w:r>
+              <w:t>79.67% (74.75–83.83)</w:t>
+            </w:r>
+          </w:p>
+        </w:tc>
+        <w:tc>
+          <w:tcPr>
+            <w:tcW w:type="dxa" w:w="1419"/>
+          </w:tcPr>
+          <w:p>
+            <w:r>
+              <w:t>88.52%</w:t>
+            </w:r>
+          </w:p>
+        </w:tc>
+        <w:tc>
+          <w:tcPr>
+            <w:tcW w:type="dxa" w:w="1419"/>
+          </w:tcPr>
+          <w:p>
+            <w:r>
+              <w:t>0.33%</w:t>
+            </w:r>
+          </w:p>
+        </w:tc>
+        <w:tc>
+          <w:tcPr>
+            <w:tcW w:type="dxa" w:w="1419"/>
+          </w:tcPr>
+          <w:p>
+            <w:r>
+              <w:t>61 / 239</w:t>
+            </w:r>
+          </w:p>
+        </w:tc>
+      </w:tr>
+      <w:tr>
+        <w:tc>
+          <w:tcPr>
+            <w:tcW w:type="dxa" w:w="1419"/>
+          </w:tcPr>
+          <w:p>
+            <w:r>
+              <w:t>Truncation control</w:t>
+            </w:r>
+          </w:p>
+        </w:tc>
+        <w:tc>
+          <w:tcPr>
+            <w:tcW w:type="dxa" w:w="1419"/>
+          </w:tcPr>
+          <w:p>
+            <w:r>
+              <w:t>94.50%</w:t>
+            </w:r>
+          </w:p>
+        </w:tc>
+        <w:tc>
+          <w:tcPr>
+            <w:tcW w:type="dxa" w:w="1419"/>
+          </w:tcPr>
+          <w:p>
+            <w:r>
+              <w:t>99.63%</w:t>
+            </w:r>
+          </w:p>
+        </w:tc>
+        <w:tc>
+          <w:tcPr>
+            <w:tcW w:type="dxa" w:w="1419"/>
+          </w:tcPr>
+          <w:p>
+            <w:r>
+              <w:t>89.33% (85.33–92.34)</w:t>
+            </w:r>
+          </w:p>
+        </w:tc>
+        <w:tc>
+          <w:tcPr>
+            <w:tcW w:type="dxa" w:w="1419"/>
+          </w:tcPr>
+          <w:p>
+            <w:r>
+              <w:t>94.20%</w:t>
+            </w:r>
+          </w:p>
+        </w:tc>
+        <w:tc>
+          <w:tcPr>
+            <w:tcW w:type="dxa" w:w="1419"/>
+          </w:tcPr>
+          <w:p>
+            <w:r>
+              <w:t>0.33%</w:t>
+            </w:r>
+          </w:p>
+        </w:tc>
+        <w:tc>
+          <w:tcPr>
+            <w:tcW w:type="dxa" w:w="1419"/>
+          </w:tcPr>
+          <w:p>
+            <w:r>
+              <w:t>32 / 268</w:t>
+            </w:r>
+          </w:p>
+        </w:tc>
+      </w:tr>
+    </w:tbl>
+    <w:p>
+      <w:r>
+        <w:t>Each condition contains 300 human passages and 300 AI passages. In every condition, 299/300 human passages were classified as human and one was incorrectly flagged as AI (FPR = 0.33%). This observed rate is based on only 300 human controls.</w:t>
+      </w:r>
+    </w:p>
+    <w:p>
+      <w:r>
+        <w:drawing>
+          <wp:inline xmlns:a="http://schemas.openxmlformats.org/drawingml/2006/main" xmlns:pic="http://schemas.openxmlformats.org/drawingml/2006/picture">
+            <wp:extent cx="5852160" cy="3218688"/>
+            <wp:docPr id="1" name="Picture 1"/>
+            <wp:cNvGraphicFramePr>
+              <a:graphicFrameLocks noChangeAspect="1"/>
+            </wp:cNvGraphicFramePr>
+            <a:graphic>
+              <a:graphicData uri="http://schemas.openxmlformats.org/drawingml/2006/picture">
+                <pic:pic>
+                  <pic:nvPicPr>
+                    <pic:cNvPr id="0" name="extended_metrics_comparison.png"/>
+                    <pic:cNvPicPr/>
+                  </pic:nvPicPr>
+                  <pic:blipFill>
+                    <a:blip r:embed="rId9"/>
+                    <a:stretch>
+                      <a:fillRect/>
+                    </a:stretch>
+                  </pic:blipFill>
+                  <pic:spPr>
+                    <a:xfrm>
+                      <a:off x="0" y="0"/>
+                      <a:ext cx="5852160" cy="3218688"/>
+                    </a:xfrm>
+                    <a:prstGeom prst="rect"/>
+                  </pic:spPr>
+                </pic:pic>
+              </a:graphicData>
+            </a:graphic>
+          </wp:inline>
+        </w:drawing>
+      </w:r>
+    </w:p>
+    <w:p>
+      <w:r>
+        <w:drawing>
+          <wp:inline xmlns:a="http://schemas.openxmlformats.org/drawingml/2006/main" xmlns:pic="http://schemas.openxmlformats.org/drawingml/2006/picture">
+            <wp:extent cx="5486400" cy="3048000"/>
+            <wp:docPr id="2" name="Picture 2"/>
+            <wp:cNvGraphicFramePr>
+              <a:graphicFrameLocks noChangeAspect="1"/>
+            </wp:cNvGraphicFramePr>
+            <a:graphic>
+              <a:graphicData uri="http://schemas.openxmlformats.org/drawingml/2006/picture">
+                <pic:pic>
+                  <pic:nvPicPr>
+                    <pic:cNvPr id="0" name="extended_recall_ci.png"/>
+                    <pic:cNvPicPr/>
+                  </pic:nvPicPr>
+                  <pic:blipFill>
+                    <a:blip r:embed="rId10"/>
+                    <a:stretch>
+                      <a:fillRect/>
+                    </a:stretch>
+                  </pic:blipFill>
+                  <pic:spPr>
+                    <a:xfrm>
+                      <a:off x="0" y="0"/>
+                      <a:ext cx="5486400" cy="3048000"/>
+                    </a:xfrm>
+                    <a:prstGeom prst="rect"/>
+                  </pic:spPr>
+                </pic:pic>
+              </a:graphicData>
+            </a:graphic>
+          </wp:inline>
+        </w:drawing>
+      </w:r>
+    </w:p>
+    <w:p>
+      <w:pPr>
+        <w:pStyle w:val="Heading1"/>
+      </w:pPr>
+      <w:r>
+        <w:t>5. Paired tests and interpretation</w:t>
+      </w:r>
+    </w:p>
+    <w:tbl>
+      <w:tblPr>
+        <w:tblStyle w:val="LightShading-Accent1"/>
+        <w:tblW w:type="auto" w:w="0"/>
         <w:tblLook w:firstColumn="1" w:firstRow="1" w:lastColumn="0" w:lastRow="0" w:noHBand="0" w:noVBand="1" w:val="04A0"/>
       </w:tblPr>
       <w:tblGrid>
@@ -123,56 +717,52 @@
         <w:tc>
           <w:tcPr>
             <w:tcW w:type="dxa" w:w="2484"/>
-            <w:vAlign w:val="center"/>
           </w:tcPr>
           <w:p>
             <w:r>
               <w:rPr>
-                <w:sz w:val="18"/>
+                <w:b/>
               </w:rPr>
-              <w:t>Metric</w:t>
+              <w:t>Comparison</w:t>
             </w:r>
           </w:p>
         </w:tc>
         <w:tc>
           <w:tcPr>
             <w:tcW w:type="dxa" w:w="2484"/>
-            <w:vAlign w:val="center"/>
           </w:tcPr>
           <w:p>
             <w:r>
               <w:rPr>
-                <w:sz w:val="18"/>
+                <w:b/>
               </w:rPr>
-              <w:t>Original AI</w:t>
+              <w:t>AI detected → missed</w:t>
             </w:r>
           </w:p>
         </w:tc>
         <w:tc>
           <w:tcPr>
             <w:tcW w:type="dxa" w:w="2484"/>
-            <w:vAlign w:val="center"/>
           </w:tcPr>
           <w:p>
             <w:r>
               <w:rPr>
-                <w:sz w:val="18"/>
+                <w:b/>
               </w:rPr>
-              <w:t>Surface-edited</w:t>
+              <w:t>AI missed → detected</w:t>
             </w:r>
           </w:p>
         </w:tc>
         <w:tc>
           <w:tcPr>
             <w:tcW w:type="dxa" w:w="2484"/>
-            <w:vAlign w:val="center"/>
           </w:tcPr>
           <w:p>
             <w:r>
               <w:rPr>
-                <w:sz w:val="18"/>
+                <w:b/>
               </w:rPr>
-              <w:t>Semantic paraphrase</w:t>
+              <w:t>Exact McNemar p</w:t>
             </w:r>
           </w:p>
         </w:tc>
@@ -181,56 +771,40 @@
         <w:tc>
           <w:tcPr>
             <w:tcW w:type="dxa" w:w="2484"/>
-            <w:vAlign w:val="center"/>
           </w:tcPr>
           <w:p>
             <w:r>
-              <w:rPr>
-                <w:sz w:val="18"/>
-              </w:rPr>
-              <w:t>Accuracy</w:t>
+              <w:t>Original vs legacy phrase-removal</w:t>
             </w:r>
           </w:p>
         </w:tc>
         <w:tc>
           <w:tcPr>
             <w:tcW w:type="dxa" w:w="2484"/>
-            <w:vAlign w:val="center"/>
           </w:tcPr>
           <w:p>
             <w:r>
-              <w:rPr>
-                <w:sz w:val="18"/>
-              </w:rPr>
-              <w:t>98.83%</w:t>
+              <w:t>0</w:t>
             </w:r>
           </w:p>
         </w:tc>
         <w:tc>
           <w:tcPr>
             <w:tcW w:type="dxa" w:w="2484"/>
-            <w:vAlign w:val="center"/>
           </w:tcPr>
           <w:p>
             <w:r>
-              <w:rPr>
-                <w:sz w:val="18"/>
-              </w:rPr>
-              <w:t>98.83%</w:t>
+              <w:t>0</w:t>
             </w:r>
           </w:p>
         </w:tc>
         <w:tc>
           <w:tcPr>
             <w:tcW w:type="dxa" w:w="2484"/>
-            <w:vAlign w:val="center"/>
           </w:tcPr>
           <w:p>
             <w:r>
-              <w:rPr>
-                <w:sz w:val="18"/>
-              </w:rPr>
-              <w:t>89.67%</w:t>
+              <w:t>1.000</w:t>
             </w:r>
           </w:p>
         </w:tc>
@@ -239,56 +813,40 @@
         <w:tc>
           <w:tcPr>
             <w:tcW w:type="dxa" w:w="2484"/>
-            <w:vAlign w:val="center"/>
           </w:tcPr>
           <w:p>
             <w:r>
-              <w:rPr>
-                <w:sz w:val="18"/>
-              </w:rPr>
-              <w:t>AI precision</w:t>
+              <w:t>Original vs verified light edit</w:t>
             </w:r>
           </w:p>
         </w:tc>
         <w:tc>
           <w:tcPr>
             <w:tcW w:type="dxa" w:w="2484"/>
-            <w:vAlign w:val="center"/>
           </w:tcPr>
           <w:p>
             <w:r>
-              <w:rPr>
-                <w:sz w:val="18"/>
-              </w:rPr>
-              <w:t>99.66%</w:t>
+              <w:t>3</w:t>
             </w:r>
           </w:p>
         </w:tc>
         <w:tc>
           <w:tcPr>
             <w:tcW w:type="dxa" w:w="2484"/>
-            <w:vAlign w:val="center"/>
           </w:tcPr>
           <w:p>
             <w:r>
-              <w:rPr>
-                <w:sz w:val="18"/>
-              </w:rPr>
-              <w:t>99.66%</w:t>
+              <w:t>0</w:t>
             </w:r>
           </w:p>
         </w:tc>
         <w:tc>
           <w:tcPr>
             <w:tcW w:type="dxa" w:w="2484"/>
-            <w:vAlign w:val="center"/>
           </w:tcPr>
           <w:p>
             <w:r>
-              <w:rPr>
-                <w:sz w:val="18"/>
-              </w:rPr>
-              <w:t>99.58%</w:t>
+              <w:t>0.250</w:t>
             </w:r>
           </w:p>
         </w:tc>
@@ -297,56 +855,40 @@
         <w:tc>
           <w:tcPr>
             <w:tcW w:type="dxa" w:w="2484"/>
-            <w:vAlign w:val="center"/>
           </w:tcPr>
           <w:p>
             <w:r>
-              <w:rPr>
-                <w:sz w:val="18"/>
-              </w:rPr>
-              <w:t>AI recall</w:t>
+              <w:t>Original vs T5 paraphrase</w:t>
             </w:r>
           </w:p>
         </w:tc>
         <w:tc>
           <w:tcPr>
             <w:tcW w:type="dxa" w:w="2484"/>
-            <w:vAlign w:val="center"/>
           </w:tcPr>
           <w:p>
             <w:r>
-              <w:rPr>
-                <w:sz w:val="18"/>
-              </w:rPr>
-              <w:t>98.00%</w:t>
+              <w:t>57</w:t>
             </w:r>
           </w:p>
         </w:tc>
         <w:tc>
           <w:tcPr>
             <w:tcW w:type="dxa" w:w="2484"/>
-            <w:vAlign w:val="center"/>
           </w:tcPr>
           <w:p>
             <w:r>
-              <w:rPr>
-                <w:sz w:val="18"/>
-              </w:rPr>
-              <w:t>98.00%</w:t>
+              <w:t>2</w:t>
             </w:r>
           </w:p>
         </w:tc>
         <w:tc>
           <w:tcPr>
             <w:tcW w:type="dxa" w:w="2484"/>
-            <w:vAlign w:val="center"/>
           </w:tcPr>
           <w:p>
             <w:r>
-              <w:rPr>
-                <w:sz w:val="18"/>
-              </w:rPr>
-              <w:t>79.67%</w:t>
+              <w:t>6.14e-15</w:t>
             </w:r>
           </w:p>
         </w:tc>
@@ -355,56 +897,40 @@
         <w:tc>
           <w:tcPr>
             <w:tcW w:type="dxa" w:w="2484"/>
-            <w:vAlign w:val="center"/>
           </w:tcPr>
           <w:p>
             <w:r>
-              <w:rPr>
-                <w:sz w:val="18"/>
-              </w:rPr>
-              <w:t>AI F1-score</w:t>
+              <w:t>Original vs truncation control</w:t>
             </w:r>
           </w:p>
         </w:tc>
         <w:tc>
           <w:tcPr>
             <w:tcW w:type="dxa" w:w="2484"/>
-            <w:vAlign w:val="center"/>
           </w:tcPr>
           <w:p>
             <w:r>
-              <w:rPr>
-                <w:sz w:val="18"/>
-              </w:rPr>
-              <w:t>98.82%</w:t>
+              <w:t>26</w:t>
             </w:r>
           </w:p>
         </w:tc>
         <w:tc>
           <w:tcPr>
             <w:tcW w:type="dxa" w:w="2484"/>
-            <w:vAlign w:val="center"/>
           </w:tcPr>
           <w:p>
             <w:r>
-              <w:rPr>
-                <w:sz w:val="18"/>
-              </w:rPr>
-              <w:t>98.82%</w:t>
+              <w:t>0</w:t>
             </w:r>
           </w:p>
         </w:tc>
         <w:tc>
           <w:tcPr>
             <w:tcW w:type="dxa" w:w="2484"/>
-            <w:vAlign w:val="center"/>
           </w:tcPr>
           <w:p>
             <w:r>
-              <w:rPr>
-                <w:sz w:val="18"/>
-              </w:rPr>
-              <w:t>88.52%</w:t>
+              <w:t>2.98e-08</w:t>
             </w:r>
           </w:p>
         </w:tc>
@@ -413,56 +939,40 @@
         <w:tc>
           <w:tcPr>
             <w:tcW w:type="dxa" w:w="2484"/>
-            <w:vAlign w:val="center"/>
           </w:tcPr>
           <w:p>
             <w:r>
-              <w:rPr>
-                <w:sz w:val="18"/>
-              </w:rPr>
-              <w:t>False-positive rate</w:t>
+              <w:t>Truncation control vs T5 paraphrase</w:t>
             </w:r>
           </w:p>
         </w:tc>
         <w:tc>
           <w:tcPr>
             <w:tcW w:type="dxa" w:w="2484"/>
-            <w:vAlign w:val="center"/>
           </w:tcPr>
           <w:p>
             <w:r>
-              <w:rPr>
-                <w:sz w:val="18"/>
-              </w:rPr>
-              <w:t>0.33%</w:t>
+              <w:t>38</w:t>
             </w:r>
           </w:p>
         </w:tc>
         <w:tc>
           <w:tcPr>
             <w:tcW w:type="dxa" w:w="2484"/>
-            <w:vAlign w:val="center"/>
           </w:tcPr>
           <w:p>
             <w:r>
-              <w:rPr>
-                <w:sz w:val="18"/>
-              </w:rPr>
-              <w:t>0.33%</w:t>
+              <w:t>9</w:t>
             </w:r>
           </w:p>
         </w:tc>
         <w:tc>
           <w:tcPr>
             <w:tcW w:type="dxa" w:w="2484"/>
-            <w:vAlign w:val="center"/>
           </w:tcPr>
           <w:p>
             <w:r>
-              <w:rPr>
-                <w:sz w:val="18"/>
-              </w:rPr>
-              <w:t>0.33%</w:t>
+              <w:t>2.49e-05</w:t>
             </w:r>
           </w:p>
         </w:tc>
@@ -470,7 +980,7 @@
     </w:tbl>
     <w:p>
       <w:r>
-        <w:t>For the original and surface-edited conditions, 294 of 300 AI passages were detected and 6 were missed. For semantic paraphrases, 239 were detected and 61 were missed. This is 55 additional false negatives and an AI-recall decline of 18.33 percentage points. One human passage was incorrectly flagged as AI in each condition, yielding an FPR of 1/300 = 0.33%.</w:t>
+        <w:t>The legacy phrase-removal edit changed no passages and no predictions. The verified light edit changed 104/300 passages; recall decreased from 98.00% to 97.00% (3 detected-to-missed, 0 missed-to-detected; exact p=0.25), which is not statistically significant at 0.05. Recall decreased to 79.67% for T5 paraphrases (57 detected-to-missed, 2 missed-to-detected; p≈6.14×10⁻¹⁵). The truncation control achieved 89.33% recall (26 detected-to-missed, 0 missed-to-detected; p≈2.98×10⁻⁸). Mean word-length ratios were 0.561 for paraphrases and 0.561 for truncation. T5 paraphrases had lower recall than the truncation control (38 detected-to-missed, 9 missed-to-detected; paired p≈2.49×10⁻⁵), but this comparison does not isolate a pure semantic effect because paraphrases may also alter content and fidelity.</w:t>
       </w:r>
     </w:p>
     <w:p>
@@ -478,12 +988,12 @@
         <w:pStyle w:val="Heading1"/>
       </w:pPr>
       <w:r>
-        <w:t>5. Supplementary surface-edit evaluation</w:t>
+        <w:t>6. Larger-sample supplementary light-edit experiment</w:t>
       </w:r>
     </w:p>
     <w:p>
       <w:r>
-        <w:t>The separate, larger robustness experiment evaluates 4,959 original AI passages, 4,959 surface-edited AI passages, and 10,198 human passages as class-specific groups. Original AI accuracy/recall was 98.37%; surface-edited AI accuracy/recall was 98.35%. For the human group, 10,123 were correctly classified as human and 75 were false positives, corresponding to an FPR of 0.74%. FPR is not meaningful for an AI-only group, and AI recall is not meaningful for a human-only group.</w:t>
+        <w:t>Across all 4,959 held-out AI passages, the detector flagged 4,878 original passages as AI (98.37%) and 4,861 deterministically edited passages as AI (98.02%). The paired predictions had 17 changed classifications (the paired detection-rate decrease was 0.34 percentage points). The human-only held-out group had 75/10,198 false positives (0.74%). This larger experiment uses a separate deterministic edit procedure and should not be conflated with the 300-topic paired pilot.</w:t>
       </w:r>
     </w:p>
     <w:p>
@@ -491,12 +1001,47 @@
         <w:pStyle w:val="Heading1"/>
       </w:pPr>
       <w:r>
-        <w:t>6. Source-level observations</w:t>
+        <w:t>7. Limitations</w:t>
       </w:r>
     </w:p>
     <w:p>
+      <w:pPr>
+        <w:pStyle w:val="ListBullet"/>
+      </w:pPr>
       <w:r>
-        <w:t>AI recall after paraphrasing decreased in Finance (100% to 78.95%), Reddit ELI5 (97.75% to 77.93%), and Open QA (95.45% to 86.36%). Medicine was unchanged in this sample. Wiki CSAI recall was 66.67% after paraphrasing, but this estimate is based on only three AI passages. Source counts are uneven, so these results are descriptive rather than robust domain-level estimates.</w:t>
+        <w:t>Generated paraphrases were not independently reviewed and rated for meaning preservation. Some outputs omit details or alter factual content.</w:t>
+      </w:r>
+    </w:p>
+    <w:p>
+      <w:pPr>
+        <w:pStyle w:val="ListBullet"/>
+      </w:pPr>
+      <w:r>
+        <w:t>The T5 paraphrases are substantially shorter: mean length ratio 0.561; 181/300 were under 60% of their original word count. The truncation control demonstrates that compression alone is associated with lower recall, although it does not fully explain the paraphrase result. One original was shorter than its paraphrase, so the truncation control has one word-count mismatch.</w:t>
+      </w:r>
+    </w:p>
+    <w:p>
+      <w:pPr>
+        <w:pStyle w:val="ListBullet"/>
+      </w:pPr>
+      <w:r>
+        <w:t>The paired sample is small and source-imbalanced, dominated by Reddit ELI5. Source-specific findings, especially Wiki CSAI (n=3), are highly uncertain.</w:t>
+      </w:r>
+    </w:p>
+    <w:p>
+      <w:pPr>
+        <w:pStyle w:val="ListBullet"/>
+      </w:pPr>
+      <w:r>
+        <w:t>Only one dataset, one principal classical detector, and one paraphrasing model were evaluated.</w:t>
+      </w:r>
+    </w:p>
+    <w:p>
+      <w:pPr>
+        <w:pStyle w:val="ListBullet"/>
+      </w:pPr>
+      <w:r>
+        <w:t>Results are conditional on the chosen dataset, split, sampling rules, transformation rules, and model implementation. Detector predictions are not proof of authorship.</w:t>
       </w:r>
     </w:p>
     <w:p>
@@ -504,55 +1049,17 @@
         <w:pStyle w:val="Heading1"/>
       </w:pPr>
       <w:r>
-        <w:t>7. Failure cases and limitations</w:t>
+        <w:t>8. Conclusion and future work</w:t>
       </w:r>
     </w:p>
     <w:p>
-      <w:pPr>
-        <w:pStyle w:val="ListBullet"/>
-      </w:pPr>
       <w:r>
-        <w:t>Only 300 paired held-out topics were included in the semantic-paraphrase pilot.</w:t>
+        <w:t>The verified light-edit condition caused a small, statistically inconclusive recall change in the paired sample, while generated T5 paraphrases produced a larger decrease. The length-matched truncation control also reduced recall, showing that the paraphrase result is partly entangled with text compression. The defensible conclusion is that this detector’s performance varies under these specific text transformations; the experiment does not establish universal robustness or isolate meaning-preserving paraphrasing.</w:t>
       </w:r>
     </w:p>
     <w:p>
-      <w:pPr>
-        <w:pStyle w:val="ListBullet"/>
-      </w:pPr>
       <w:r>
-        <w:t>The sample is source-imbalanced, with Reddit ELI5 dominant.</w:t>
-      </w:r>
-    </w:p>
-    <w:p>
-      <w:pPr>
-        <w:pStyle w:val="ListBullet"/>
-      </w:pPr>
-      <w:r>
-        <w:t>Only one classical detector and one paraphraser were evaluated.</w:t>
-      </w:r>
-    </w:p>
-    <w:p>
-      <w:pPr>
-        <w:pStyle w:val="ListBullet"/>
-      </w:pPr>
-      <w:r>
-        <w:t>Some paraphrases changed facts, substituted examples, or removed qualifications and numerical details.</w:t>
-      </w:r>
-    </w:p>
-    <w:p>
-      <w:pPr>
-        <w:pStyle w:val="ListBullet"/>
-      </w:pPr>
-      <w:r>
-        <w:t>The study measures robustness to the outputs of this paraphrasing process, not exclusively to meaning-preserving paraphrases.</w:t>
-      </w:r>
-    </w:p>
-    <w:p>
-      <w:pPr>
-        <w:pStyle w:val="ListBullet"/>
-      </w:pPr>
-      <w:r>
-        <w:t>High metrics on this dataset do not establish general performance on other datasets, generators, or detectors.</w:t>
+        <w:t>Next steps: human-review paraphrase fidelity; run a quality-filtered analysis; expand and balance the sample; evaluate more detectors and paraphrasers; and test human edits and multiple split seeds.</w:t>
       </w:r>
     </w:p>
     <w:p>
@@ -560,73 +1067,47 @@
         <w:pStyle w:val="Heading1"/>
       </w:pPr>
       <w:r>
-        <w:t>8. Conclusion</w:t>
-      </w:r>
-    </w:p>
-    <w:p>
-      <w:r>
-        <w:t>In this HC3 experiment, the tested surface edits did not measurably change paired-evaluation performance, whereas semantic-paraphraser outputs reduced AI recall from 98.00% to 79.67%. The corresponding false negatives increased from 6 to 61 while the false-positive rate remained 0.33%. These findings support further testing of text detectors under rewriting, but should be interpreted as evidence about this detector, dataset, and paraphrasing process rather than all AI-text detectors.</w:t>
+        <w:t>References</w:t>
       </w:r>
     </w:p>
     <w:p>
       <w:pPr>
-        <w:pStyle w:val="Heading1"/>
+        <w:pStyle w:val="ListNumber"/>
       </w:pPr>
       <w:r>
-        <w:t>9. Future work</w:t>
+        <w:t>Guo, B. et al. (2023). How Close is ChatGPT to Human Experts? Comparison Corpus, Evaluation, and Detection. arXiv:2301.07597. https://arxiv.org/abs/2301.07597</w:t>
       </w:r>
     </w:p>
     <w:p>
       <w:pPr>
-        <w:pStyle w:val="ListBullet"/>
+        <w:pStyle w:val="ListNumber"/>
       </w:pPr>
       <w:r>
-        <w:t>Human-review paraphrases for semantic fidelity and report both raw and quality-filtered results.</w:t>
+        <w:t>HC3 dataset: https://huggingface.co/datasets/Hello-SimpleAI/HC3</w:t>
       </w:r>
     </w:p>
     <w:p>
       <w:pPr>
-        <w:pStyle w:val="ListBullet"/>
+        <w:pStyle w:val="ListNumber"/>
       </w:pPr>
       <w:r>
-        <w:t>Increase the paired sample size and balance the source distribution.</w:t>
+        <w:t>Paraphrasing model: humarin/chatgpt_paraphraser_on_T5_base. https://huggingface.co/humarin/chatgpt_paraphraser_on_T5_base</w:t>
       </w:r>
     </w:p>
     <w:p>
       <w:pPr>
-        <w:pStyle w:val="ListBullet"/>
+        <w:pStyle w:val="ListNumber"/>
       </w:pPr>
       <w:r>
-        <w:t>Test additional detectors, text generators, paraphrasers, and human editing patterns.</w:t>
+        <w:t>scikit-learn GroupShuffleSplit: https://scikit-learn.org/stable/modules/generated/sklearn.model_selection.GroupShuffleSplit.html</w:t>
       </w:r>
     </w:p>
     <w:p>
       <w:pPr>
-        <w:pStyle w:val="ListBullet"/>
+        <w:pStyle w:val="ListNumber"/>
       </w:pPr>
       <w:r>
-        <w:t>Report per-source sample counts and uncertainty intervals.</w:t>
-      </w:r>
-    </w:p>
-    <w:p>
-      <w:pPr>
-        <w:pStyle w:val="ListBullet"/>
-      </w:pPr>
-      <w:r>
-        <w:t>Preserve the grouped topic split and audit all data transformations for leakage.</w:t>
-      </w:r>
-    </w:p>
-    <w:p>
-      <w:pPr>
-        <w:pStyle w:val="Heading1"/>
-      </w:pPr>
-      <w:r>
-        <w:t>Reproducibility</w:t>
-      </w:r>
-    </w:p>
-    <w:p>
-      <w:r>
-        <w:t>The repository contains the preparation, baseline, surface-edit robustness, paraphrase-generation, and final evaluation scripts. Run them from the repository root in that order, using Python 3.12 and the dependencies listed in requirements.txt. Dataset/model downloads require internet access. Existing validated outputs should be backed up before rerunning scripts because generated files may be overwritten.</w:t>
+        <w:t>scikit-learn text feature extraction and SVM documentation: https://scikit-learn.org/stable/modules/feature_extraction.html and https://scikit-learn.org/stable/modules/svm.html</w:t>
       </w:r>
     </w:p>
     <w:sectPr>
@@ -1004,7 +1485,7 @@
     <w:rsid w:val="00FC693F"/>
     <w:rPr>
       <w:rFonts w:ascii="Aptos" w:hAnsi="Aptos"/>
-      <w:sz w:val="20"/>
+      <w:sz w:val="19"/>
     </w:rPr>
   </w:style>
   <w:style w:type="paragraph" w:styleId="Header">
@@ -1069,7 +1550,7 @@
       <w:rFonts w:asciiTheme="majorHAnsi" w:eastAsiaTheme="majorEastAsia" w:hAnsiTheme="majorHAnsi" w:cstheme="majorBidi" w:ascii="Aptos Display" w:hAnsi="Aptos Display"/>
       <w:b/>
       <w:bCs/>
-      <w:color w:val="365F91" w:themeColor="accent1" w:themeShade="BF"/>
+      <w:color w:val="1F4E79"/>
       <w:sz w:val="32"/>
       <w:szCs w:val="28"/>
     </w:rPr>
@@ -1093,7 +1574,7 @@
       <w:rFonts w:asciiTheme="majorHAnsi" w:eastAsiaTheme="majorEastAsia" w:hAnsiTheme="majorHAnsi" w:cstheme="majorBidi" w:ascii="Aptos Display" w:hAnsi="Aptos Display"/>
       <w:b/>
       <w:bCs/>
-      <w:color w:val="4F81BD" w:themeColor="accent1"/>
+      <w:color w:val="1F4E79"/>
       <w:sz w:val="24"/>
       <w:szCs w:val="26"/>
     </w:rPr>
@@ -1356,10 +1837,11 @@
     </w:pPr>
     <w:rPr>
       <w:rFonts w:asciiTheme="majorHAnsi" w:eastAsiaTheme="majorEastAsia" w:hAnsiTheme="majorHAnsi" w:cstheme="majorBidi" w:ascii="Aptos Display" w:hAnsi="Aptos Display"/>
+      <w:b/>
       <w:color w:val="17365D" w:themeColor="text2" w:themeShade="BF"/>
       <w:spacing w:val="5"/>
       <w:kern w:val="28"/>
-      <w:sz w:val="48"/>
+      <w:sz w:val="50"/>
       <w:szCs w:val="52"/>
     </w:rPr>
   </w:style>

</xml_diff>